<commit_message>
Document optional OTA with no long-term guarantee in the user manual.
Co-authored-by: Cursor <cursoragent@cursor.com>
</commit_message>
<xml_diff>
--- a/User_Manual.docx
+++ b/User_Manual.docx
@@ -450,7 +450,7 @@
           <w:rFonts w:ascii="Consolas" w:hAnsi="Consolas" w:eastAsia="Consolas"/>
           <w:sz w:val="20"/>
         </w:rPr>
-        <w:t xml:space="preserve">   WiFi 192.168.x.x</w:t>
+        <w:t xml:space="preserve">   WiFi [####]</w:t>
       </w:r>
     </w:p>
     <w:p>
@@ -467,14 +467,14 @@
           <w:b w:val="0"/>
           <w:sz w:val="20"/>
         </w:rPr>
-        <w:t>192.168.x.x</w:t>
+        <w:t>#</w:t>
       </w:r>
       <w:r>
         <w:rPr>
           <w:rFonts w:ascii="Microsoft YaHei" w:hAnsi="Microsoft YaHei" w:eastAsia="Microsoft YaHei"/>
           <w:b w:val="0"/>
         </w:rPr>
-        <w:t xml:space="preserve"> 为设备局域网 IP）。</w:t>
+        <w:t xml:space="preserve"> 越多信号越好；不再显示 IP）。</w:t>
       </w:r>
     </w:p>
     <w:p>
@@ -532,14 +532,14 @@
           <w:rFonts w:ascii="Microsoft YaHei" w:hAnsi="Microsoft YaHei" w:eastAsia="Microsoft YaHei"/>
           <w:b/>
         </w:rPr>
-        <w:t>大约 3 分钟内</w:t>
+        <w:t>大约 1 分钟内</w:t>
       </w:r>
       <w:r>
         <w:rPr>
           <w:rFonts w:ascii="Microsoft YaHei" w:hAnsi="Microsoft YaHei" w:eastAsia="Microsoft YaHei"/>
           <w:b w:val="0"/>
         </w:rPr>
-        <w:t>（默认：连续失败 3 次）仍连不上时，会再次打开配网热点。</w:t>
+        <w:t>（默认：连续失败 2 次）仍连不上时，会再次打开配网热点。</w:t>
       </w:r>
     </w:p>
     <w:p>
@@ -706,7 +706,7 @@
                 <w:b w:val="0"/>
                 <w:sz w:val="20"/>
               </w:rPr>
-              <w:t>约 20 秒</w:t>
+              <w:t>约 15 秒</w:t>
             </w:r>
           </w:p>
         </w:tc>
@@ -756,7 +756,7 @@
                 <w:b w:val="0"/>
                 <w:sz w:val="20"/>
               </w:rPr>
-              <w:t>约 60 秒</w:t>
+              <w:t>约 30 秒</w:t>
             </w:r>
           </w:p>
         </w:tc>
@@ -806,7 +806,7 @@
                 <w:b w:val="0"/>
                 <w:sz w:val="20"/>
               </w:rPr>
-              <w:t>3 次</w:t>
+              <w:t>2 次</w:t>
             </w:r>
           </w:p>
         </w:tc>
@@ -856,7 +856,7 @@
                 <w:b w:val="0"/>
                 <w:sz w:val="20"/>
               </w:rPr>
-              <w:t>约 3 分钟</w:t>
+              <w:t>约 1 分钟</w:t>
             </w:r>
           </w:p>
         </w:tc>
@@ -904,7 +904,7 @@
           <w:b w:val="0"/>
           <w:i/>
         </w:rPr>
-        <w:t>成功连过网：第一次约 20 秒连不上就会直接打开配网热点。</w:t>
+        <w:t>成功连过网：第一次约 15 秒连不上就会直接打开配网热点。</w:t>
       </w:r>
     </w:p>
     <w:p>
@@ -927,6 +927,25 @@
           <w:b w:val="0"/>
         </w:rPr>
         <w:t>屏幕通常显示：</w:t>
+      </w:r>
+    </w:p>
+    <w:p>
+      <w:pPr>
+        <w:pStyle w:val="ListBullet"/>
+      </w:pPr>
+      <w:r>
+        <w:rPr>
+          <w:rFonts w:ascii="Microsoft YaHei" w:hAnsi="Microsoft YaHei" w:eastAsia="Microsoft YaHei"/>
+          <w:b/>
+        </w:rPr>
+        <w:t>日期 / 时间</w:t>
+      </w:r>
+      <w:r>
+        <w:rPr>
+          <w:rFonts w:ascii="Microsoft YaHei" w:hAnsi="Microsoft YaHei" w:eastAsia="Microsoft YaHei"/>
+          <w:b w:val="0"/>
+        </w:rPr>
+        <w:t xml:space="preserve">（联网后通过 NTP 自动对时；约每分钟随电子纸刷新）  </w:t>
       </w:r>
     </w:p>
     <w:p>
@@ -982,6 +1001,69 @@
           <w:b w:val="0"/>
         </w:rPr>
         <w:t xml:space="preserve"> WiFi 状态  </w:t>
+      </w:r>
+    </w:p>
+    <w:p>
+      <w:r>
+        <w:rPr>
+          <w:rFonts w:ascii="Microsoft YaHei" w:hAnsi="Microsoft YaHei" w:eastAsia="Microsoft YaHei"/>
+          <w:b w:val="0"/>
+        </w:rPr>
+        <w:t xml:space="preserve">未联网或尚未对时成功时，日期/时间可能显示为 </w:t>
+      </w:r>
+      <w:r>
+        <w:rPr>
+          <w:rFonts w:ascii="Consolas" w:hAnsi="Consolas" w:eastAsia="Consolas"/>
+          <w:b w:val="0"/>
+          <w:sz w:val="20"/>
+        </w:rPr>
+        <w:t>--</w:t>
+      </w:r>
+      <w:r>
+        <w:rPr>
+          <w:rFonts w:ascii="Microsoft YaHei" w:hAnsi="Microsoft YaHei" w:eastAsia="Microsoft YaHei"/>
+          <w:b w:val="0"/>
+        </w:rPr>
+        <w:t xml:space="preserve"> / </w:t>
+      </w:r>
+      <w:r>
+        <w:rPr>
+          <w:rFonts w:ascii="Consolas" w:hAnsi="Consolas" w:eastAsia="Consolas"/>
+          <w:b w:val="0"/>
+          <w:sz w:val="20"/>
+        </w:rPr>
+        <w:t>--:--</w:t>
+      </w:r>
+      <w:r>
+        <w:rPr>
+          <w:rFonts w:ascii="Microsoft YaHei" w:hAnsi="Microsoft YaHei" w:eastAsia="Microsoft YaHei"/>
+          <w:b w:val="0"/>
+        </w:rPr>
+        <w:t>。</w:t>
+      </w:r>
+    </w:p>
+    <w:p>
+      <w:r>
+        <w:rPr>
+          <w:rFonts w:ascii="Microsoft YaHei" w:hAnsi="Microsoft YaHei" w:eastAsia="Microsoft YaHei"/>
+          <w:b w:val="0"/>
+        </w:rPr>
+        <w:t xml:space="preserve">时区在设备配置中设置（默认美国太平洋 </w:t>
+      </w:r>
+      <w:r>
+        <w:rPr>
+          <w:rFonts w:ascii="Consolas" w:hAnsi="Consolas" w:eastAsia="Consolas"/>
+          <w:b w:val="0"/>
+          <w:sz w:val="20"/>
+        </w:rPr>
+        <w:t>TIMEZONE_OFFSET_HOURS = -7</w:t>
+      </w:r>
+      <w:r>
+        <w:rPr>
+          <w:rFonts w:ascii="Microsoft YaHei" w:hAnsi="Microsoft YaHei" w:eastAsia="Microsoft YaHei"/>
+          <w:b w:val="0"/>
+        </w:rPr>
+        <w:t>）。</w:t>
       </w:r>
     </w:p>
     <w:tbl>
@@ -1075,7 +1157,7 @@
                 <w:b w:val="0"/>
                 <w:sz w:val="20"/>
               </w:rPr>
-              <w:t>WiFi 192.168.x.x</w:t>
+              <w:t>WiFi [####] / WiFi [##--] 等</w:t>
             </w:r>
           </w:p>
         </w:tc>
@@ -1091,7 +1173,7 @@
                 <w:b w:val="0"/>
                 <w:sz w:val="20"/>
               </w:rPr>
-              <w:t>已连接，显示本机 IP</w:t>
+              <w:t>已连接；# 为信号格（越满越好）</w:t>
             </w:r>
           </w:p>
         </w:tc>
@@ -1206,14 +1288,14 @@
           <w:rFonts w:ascii="Microsoft YaHei" w:hAnsi="Microsoft YaHei" w:eastAsia="Microsoft YaHei"/>
           <w:b/>
         </w:rPr>
-        <w:t>60 秒</w:t>
+        <w:t>30 秒</w:t>
       </w:r>
       <w:r>
         <w:rPr>
           <w:rFonts w:ascii="Microsoft YaHei" w:hAnsi="Microsoft YaHei" w:eastAsia="Microsoft YaHei"/>
           <w:b w:val="0"/>
         </w:rPr>
-        <w:t xml:space="preserve"> 刷新一次画面（以减少闪烁与耗电）。</w:t>
+        <w:t xml:space="preserve"> 刷新一次画面，并在传感器页与日历页之间切换。</w:t>
       </w:r>
     </w:p>
     <w:p>
@@ -1238,7 +1320,89 @@
           <w:b w:val="0"/>
           <w:sz w:val="28"/>
         </w:rPr>
-        <w:t>6. 常见问题</w:t>
+        <w:t>6. 软件更新（OTA）</w:t>
+      </w:r>
+    </w:p>
+    <w:p>
+      <w:pPr>
+        <w:pStyle w:val="ListBullet"/>
+      </w:pPr>
+      <w:r>
+        <w:rPr>
+          <w:rFonts w:ascii="Microsoft YaHei" w:hAnsi="Microsoft YaHei" w:eastAsia="Microsoft YaHei"/>
+          <w:b w:val="0"/>
+        </w:rPr>
+        <w:t>设备在连上家里的 WiFi 后，</w:t>
+      </w:r>
+      <w:r>
+        <w:rPr>
+          <w:rFonts w:ascii="Microsoft YaHei" w:hAnsi="Microsoft YaHei" w:eastAsia="Microsoft YaHei"/>
+          <w:b/>
+        </w:rPr>
+        <w:t>可能</w:t>
+      </w:r>
+      <w:r>
+        <w:rPr>
+          <w:rFonts w:ascii="Microsoft YaHei" w:hAnsi="Microsoft YaHei" w:eastAsia="Microsoft YaHei"/>
+          <w:b w:val="0"/>
+        </w:rPr>
+        <w:t>通过网络自动下载软件更新（OTA）。</w:t>
+      </w:r>
+    </w:p>
+    <w:p>
+      <w:pPr>
+        <w:pStyle w:val="ListBullet"/>
+      </w:pPr>
+      <w:r>
+        <w:rPr>
+          <w:rFonts w:ascii="Microsoft YaHei" w:hAnsi="Microsoft YaHei" w:eastAsia="Microsoft YaHei"/>
+          <w:b w:val="0"/>
+        </w:rPr>
+        <w:t>更新时设备可能会短暂重启；一般无需操作。</w:t>
+      </w:r>
+    </w:p>
+    <w:p>
+      <w:pPr>
+        <w:pStyle w:val="ListBullet"/>
+      </w:pPr>
+      <w:r>
+        <w:rPr>
+          <w:rFonts w:ascii="Microsoft YaHei" w:hAnsi="Microsoft YaHei" w:eastAsia="Microsoft YaHei"/>
+          <w:b/>
+        </w:rPr>
+        <w:t>不保证长期提供或持续更新。</w:t>
+      </w:r>
+      <w:r>
+        <w:rPr>
+          <w:rFonts w:ascii="Microsoft YaHei" w:hAnsi="Microsoft YaHei" w:eastAsia="Microsoft YaHei"/>
+          <w:b w:val="0"/>
+        </w:rPr>
+        <w:t xml:space="preserve"> OTA 为增值功能，卖家可能随时调整、暂停或停止该服务。</w:t>
+      </w:r>
+    </w:p>
+    <w:p>
+      <w:pPr>
+        <w:pStyle w:val="ListBullet"/>
+      </w:pPr>
+      <w:r>
+        <w:rPr>
+          <w:rFonts w:ascii="Microsoft YaHei" w:hAnsi="Microsoft YaHei" w:eastAsia="Microsoft YaHei"/>
+          <w:b w:val="0"/>
+        </w:rPr>
+        <w:t>即使没有 OTA，设备在配好 WiFi 后仍可正常测温、显示与对时。</w:t>
+      </w:r>
+    </w:p>
+    <w:p>
+      <w:pPr>
+        <w:pStyle w:val="Heading1"/>
+      </w:pPr>
+      <w:r>
+        <w:rPr>
+          <w:rFonts w:ascii="Microsoft YaHei" w:hAnsi="Microsoft YaHei" w:eastAsia="Microsoft YaHei"/>
+          <w:b w:val="0"/>
+          <w:sz w:val="28"/>
+        </w:rPr>
+        <w:t>7. 常见问题</w:t>
       </w:r>
     </w:p>
     <w:p>
@@ -1342,7 +1506,7 @@
           <w:rFonts w:ascii="Microsoft YaHei" w:hAnsi="Microsoft YaHei" w:eastAsia="Microsoft YaHei"/>
           <w:b w:val="0"/>
         </w:rPr>
-        <w:t>；密码无误；路由器未开启仅 5G / 访客网络限制。等待约 3 分钟后可再次进入配网重试。</w:t>
+        <w:t>；密码无误；路由器未开启仅 5G / 访客网络限制。等待约 1 分钟后可再次进入配网重试。</w:t>
       </w:r>
     </w:p>
     <w:p>
@@ -1367,7 +1531,46 @@
           <w:rFonts w:ascii="Microsoft YaHei" w:hAnsi="Microsoft YaHei" w:eastAsia="Microsoft YaHei"/>
           <w:b w:val="0"/>
         </w:rPr>
-        <w:t>A：电子纸约每分钟刷一次属正常。若完全无变化，检查供电后重新插拔 USB 电源。</w:t>
+        <w:t>A：电子纸约每 30 秒刷一次属正常。若完全无变化，检查供电后重新插拔 USB 电源。</w:t>
+      </w:r>
+    </w:p>
+    <w:p>
+      <w:r>
+        <w:rPr>
+          <w:rFonts w:ascii="Microsoft YaHei" w:hAnsi="Microsoft YaHei" w:eastAsia="Microsoft YaHei"/>
+          <w:b/>
+        </w:rPr>
+        <w:t>Q：一定会有软件更新吗？</w:t>
+      </w:r>
+      <w:r>
+        <w:rPr>
+          <w:rFonts w:ascii="Microsoft YaHei" w:hAnsi="Microsoft YaHei" w:eastAsia="Microsoft YaHei"/>
+          <w:b w:val="0"/>
+        </w:rPr>
+        <w:t xml:space="preserve">  </w:t>
+      </w:r>
+    </w:p>
+    <w:p>
+      <w:r>
+        <w:rPr>
+          <w:rFonts w:ascii="Microsoft YaHei" w:hAnsi="Microsoft YaHei" w:eastAsia="Microsoft YaHei"/>
+          <w:b w:val="0"/>
+        </w:rPr>
+        <w:t>A：不一定。可能提供 OTA 更新，</w:t>
+      </w:r>
+      <w:r>
+        <w:rPr>
+          <w:rFonts w:ascii="Microsoft YaHei" w:hAnsi="Microsoft YaHei" w:eastAsia="Microsoft YaHei"/>
+          <w:b/>
+        </w:rPr>
+        <w:t>不保证长期</w:t>
+      </w:r>
+      <w:r>
+        <w:rPr>
+          <w:rFonts w:ascii="Microsoft YaHei" w:hAnsi="Microsoft YaHei" w:eastAsia="Microsoft YaHei"/>
+          <w:b w:val="0"/>
+        </w:rPr>
+        <w:t>。详见第 6 节。</w:t>
       </w:r>
     </w:p>
     <w:p>
@@ -1380,7 +1583,7 @@
           <w:b w:val="0"/>
           <w:sz w:val="28"/>
         </w:rPr>
-        <w:t>7. First-time WiFi setup (English)</w:t>
+        <w:t>8. First-time WiFi setup (English)</w:t>
       </w:r>
     </w:p>
     <w:p>
@@ -1531,14 +1734,29 @@
           <w:b w:val="0"/>
           <w:sz w:val="20"/>
         </w:rPr>
-        <w:t>WiFi 192.168.x.x</w:t>
+        <w:t>WiFi [####]</w:t>
       </w:r>
       <w:r>
         <w:rPr>
           <w:rFonts w:ascii="Microsoft YaHei" w:hAnsi="Microsoft YaHei" w:eastAsia="Microsoft YaHei"/>
           <w:b w:val="0"/>
         </w:rPr>
-        <w:t>.</w:t>
+        <w:t xml:space="preserve"> (signal bars; more </w:t>
+      </w:r>
+      <w:r>
+        <w:rPr>
+          <w:rFonts w:ascii="Consolas" w:hAnsi="Consolas" w:eastAsia="Consolas"/>
+          <w:b w:val="0"/>
+          <w:sz w:val="20"/>
+        </w:rPr>
+        <w:t>#</w:t>
+      </w:r>
+      <w:r>
+        <w:rPr>
+          <w:rFonts w:ascii="Microsoft YaHei" w:hAnsi="Microsoft YaHei" w:eastAsia="Microsoft YaHei"/>
+          <w:b w:val="0"/>
+        </w:rPr>
+        <w:t xml:space="preserve"> = stronger).</w:t>
       </w:r>
     </w:p>
     <w:p>
@@ -1567,7 +1785,7 @@
           <w:rFonts w:ascii="Microsoft YaHei" w:hAnsi="Microsoft YaHei" w:eastAsia="Microsoft YaHei"/>
           <w:b/>
         </w:rPr>
-        <w:t>3 minutes</w:t>
+        <w:t>1 minute</w:t>
       </w:r>
       <w:r>
         <w:rPr>
@@ -1594,6 +1812,56 @@
     </w:p>
     <w:p>
       <w:pPr>
+        <w:pStyle w:val="Heading2"/>
+      </w:pPr>
+      <w:r>
+        <w:rPr>
+          <w:rFonts w:ascii="Microsoft YaHei" w:hAnsi="Microsoft YaHei" w:eastAsia="Microsoft YaHei"/>
+          <w:b w:val="0"/>
+          <w:sz w:val="24"/>
+        </w:rPr>
+        <w:t>Software updates (OTA)</w:t>
+      </w:r>
+    </w:p>
+    <w:p>
+      <w:r>
+        <w:rPr>
+          <w:rFonts w:ascii="Microsoft YaHei" w:hAnsi="Microsoft YaHei" w:eastAsia="Microsoft YaHei"/>
+          <w:b w:val="0"/>
+        </w:rPr>
+        <w:t xml:space="preserve">The device </w:t>
+      </w:r>
+      <w:r>
+        <w:rPr>
+          <w:rFonts w:ascii="Microsoft YaHei" w:hAnsi="Microsoft YaHei" w:eastAsia="Microsoft YaHei"/>
+          <w:b/>
+        </w:rPr>
+        <w:t>may</w:t>
+      </w:r>
+      <w:r>
+        <w:rPr>
+          <w:rFonts w:ascii="Microsoft YaHei" w:hAnsi="Microsoft YaHei" w:eastAsia="Microsoft YaHei"/>
+          <w:b w:val="0"/>
+        </w:rPr>
+        <w:t xml:space="preserve"> download software updates over WiFi (OTA) after it joins your network. Updates are </w:t>
+      </w:r>
+      <w:r>
+        <w:rPr>
+          <w:rFonts w:ascii="Microsoft YaHei" w:hAnsi="Microsoft YaHei" w:eastAsia="Microsoft YaHei"/>
+          <w:b/>
+        </w:rPr>
+        <w:t>not guaranteed long-term</w:t>
+      </w:r>
+      <w:r>
+        <w:rPr>
+          <w:rFonts w:ascii="Microsoft YaHei" w:hAnsi="Microsoft YaHei" w:eastAsia="Microsoft YaHei"/>
+          <w:b w:val="0"/>
+        </w:rPr>
+        <w:t xml:space="preserve"> and may be changed, paused, or stopped at any time. The product still works for sensing, display, and clock sync without OTA.</w:t>
+      </w:r>
+    </w:p>
+    <w:p>
+      <w:pPr>
         <w:pStyle w:val="Heading1"/>
       </w:pPr>
       <w:r>
@@ -1602,7 +1870,7 @@
           <w:b w:val="0"/>
           <w:sz w:val="28"/>
         </w:rPr>
-        <w:t>8. 安全提示</w:t>
+        <w:t>9. 安全提示</w:t>
       </w:r>
     </w:p>
     <w:p>
@@ -1696,7 +1964,33 @@
           <w:rFonts w:ascii="Microsoft YaHei" w:hAnsi="Microsoft YaHei" w:eastAsia="Microsoft YaHei"/>
           <w:b w:val="0"/>
         </w:rPr>
-        <w:t>（按产品接线说明）。</w:t>
+        <w:t xml:space="preserve">（按产品接线说明）。  </w:t>
+      </w:r>
+    </w:p>
+    <w:p>
+      <w:pPr>
+        <w:pStyle w:val="ListBullet"/>
+      </w:pPr>
+      <w:r>
+        <w:rPr>
+          <w:rFonts w:ascii="Microsoft YaHei" w:hAnsi="Microsoft YaHei" w:eastAsia="Microsoft YaHei"/>
+          <w:b w:val="0"/>
+        </w:rPr>
+        <w:t>软件更新（OTA）为可选增值服务，</w:t>
+      </w:r>
+      <w:r>
+        <w:rPr>
+          <w:rFonts w:ascii="Microsoft YaHei" w:hAnsi="Microsoft YaHei" w:eastAsia="Microsoft YaHei"/>
+          <w:b/>
+        </w:rPr>
+        <w:t>不保证长期提供</w:t>
+      </w:r>
+      <w:r>
+        <w:rPr>
+          <w:rFonts w:ascii="Microsoft YaHei" w:hAnsi="Microsoft YaHei" w:eastAsia="Microsoft YaHei"/>
+          <w:b w:val="0"/>
+        </w:rPr>
+        <w:t>。</w:t>
       </w:r>
     </w:p>
     <w:sectPr>

</xml_diff>